<commit_message>
fix(malleus): atualizar PDF/DOCX com citações e referências ABNT perfeitas sem Iconocracia
</commit_message>
<xml_diff>
--- a/assets/malleus/Artigo — Malleus e a construcao da bruxaria.docx
+++ b/assets/malleus/Artigo — Malleus e a construcao da bruxaria.docx
@@ -26,7 +26,7 @@
         <w:t xml:space="preserve">2026</w:t>
       </w:r>
     </w:p>
-    <w:bookmarkStart w:id="16" w:name="X1bebdaafcaca100ddf78e7be89763f6ca2f3795"/>
+    <w:bookmarkStart w:id="18" w:name="X1bebdaafcaca100ddf78e7be89763f6ca2f3795"/>
     <w:p>
       <w:pPr>
         <w:pStyle w:val="Heading1"/>
@@ -116,7 +116,7 @@
         <w:t xml:space="preserve"> </w:t>
       </w:r>
       <w:r>
-        <w:t xml:space="preserve">na Europa moderna e sua posterior recepção no espaço atlântico colonial, deparamo-nos não com uma realidade fática preexistente, mas com um complexo processo de criminalização e construção doutrinária de um tipo penal. Para compreender a gênese e a circulação desse crime de exceção, o referencial teórico proposto por Mario Sbriccoli (2011) revela-se indispensável.</w:t>
+        <w:t xml:space="preserve">na Europa moderna e sua posterior recepção no espaço atlântico colonial, deparamo-nos não com uma realidade fática preexistente, mas com um complexo processo de criminalização e construção doutrinária de um tipo penal. Para compreender a gênese e a circulação desse crime de exceção, o referencial teórico proposto por Sbriccoli (2011) revela-se indispensável.</w:t>
       </w:r>
     </w:p>
     <w:p>
@@ -124,7 +124,7 @@
         <w:pStyle w:val="BodyText"/>
       </w:pPr>
       <w:r>
-        <w:t xml:space="preserve">Sbriccoli diagnostica a transição gradual entre dois modelos concorrentes de justiça na Europa medieval e moderna: a</w:t>
+        <w:t xml:space="preserve">Sbriccoli (2011) diagnostica a transição gradual entre dois modelos concorrentes de justiça na Europa medieval e moderna: a</w:t>
       </w:r>
       <w:r>
         <w:t xml:space="preserve"> </w:t>
@@ -140,7 +140,17 @@
         <w:t xml:space="preserve"> </w:t>
       </w:r>
       <w:r>
-        <w:t xml:space="preserve">e a</w:t>
+        <w:t xml:space="preserve">(</w:t>
+      </w:r>
+      <w:r>
+        <w:rPr>
+          <w:i/>
+          <w:iCs/>
+        </w:rPr>
+        <w:t xml:space="preserve">giustizia negoziata</w:t>
+      </w:r>
+      <w:r>
+        <w:t xml:space="preserve">) e a</w:t>
       </w:r>
       <w:r>
         <w:t xml:space="preserve"> </w:t>
@@ -153,7 +163,20 @@
         <w:t xml:space="preserve">justiça hegemônica</w:t>
       </w:r>
       <w:r>
-        <w:t xml:space="preserve">. A primeira, de base eminentemente privada e consensual, operava sob a égide da composição, da mediação de conflitos e do restabelecimento da paz entre linhagens familiares. A infração penal era compreendida como um dano intersubjetivo passível de transação.</w:t>
+        <w:t xml:space="preserve"> </w:t>
+      </w:r>
+      <w:r>
+        <w:t xml:space="preserve">(</w:t>
+      </w:r>
+      <w:r>
+        <w:rPr>
+          <w:i/>
+          <w:iCs/>
+        </w:rPr>
+        <w:t xml:space="preserve">giustizia egemonica</w:t>
+      </w:r>
+      <w:r>
+        <w:t xml:space="preserve">). A primeira, de base eminentemente privada e consensual, operava sob a égide da composição, da mediação de conflitos e do restabelecimento da paz entre linhagens familiares. A infração penal era compreendida como um dano intersubjetivo passível de transação.</w:t>
       </w:r>
     </w:p>
     <w:p>
@@ -415,7 +438,10 @@
         <w:t xml:space="preserve">bruxa</w:t>
       </w:r>
       <w:r>
-        <w:t xml:space="preserve">. Sob a ótica do</w:t>
+        <w:t xml:space="preserve"> </w:t>
+      </w:r>
+      <w:r>
+        <w:t xml:space="preserve">(BROEDEL, 2003). Sob a ótica do</w:t>
       </w:r>
       <w:r>
         <w:t xml:space="preserve"> </w:t>
@@ -476,7 +502,7 @@
         <w:t xml:space="preserve"> </w:t>
       </w:r>
       <w:r>
-        <w:t xml:space="preserve">concreto: exigiam provas tangíveis e o nexo de causalidade material entre a prática mágica e o dano alegado. Chocados com a obsessão sexual de Institoris e com o arbítrio procedimental, os comissários nomearam um advogado de defesa para Helena.</w:t>
+        <w:t xml:space="preserve">concreto: exigiam provas tangíveis e o nexo de causalidade material entre a prática mágica e o dano alegado. Chocados com a obsessão sexual de Institoris e com o arbitrio procedimental, os comissários nomearam um advogado de defesa para Helena.</w:t>
       </w:r>
     </w:p>
     <w:p>
@@ -541,7 +567,7 @@
         <w:t xml:space="preserve"> </w:t>
       </w:r>
       <w:r>
-        <w:t xml:space="preserve">sofreu deformações estruturais. O Brasil colonial, diferentemente do Vice-Reino do México ou do Peru, nunca contou com um tribunal inquisitorial permanente. A jurisdição do Santo Ofício manifestava-se por meio de visitas episcopais ordinárias e, sobretudo, pelas</w:t>
+        <w:t xml:space="preserve">sofreu deformações estruturais. O Brasil colonial, diferentemente do Vice-Reino do México ou do Peru, nunca contou com um tribunal permanente do Santo Ofício. A governança da máquina processual dependia de</w:t>
       </w:r>
       <w:r>
         <w:t xml:space="preserve"> </w:t>
@@ -565,7 +591,7 @@
         <w:pStyle w:val="BodyText"/>
       </w:pPr>
       <w:r>
-        <w:t xml:space="preserve">Em junho de 1591, o Visitador Heitor Furtado de Mendonça aportou em Salvador da Bahia, abrindo oficialmente o Tempo de Graça. A Visitação inaugurava um modelo híbrido de controle social: ao mesmo tempo em que ostentava o rigor da justiça hegemônica régio-eclesiástica, baseava-se inteiramente na colaboração comunitária por meio de confissões voluntárias e denunciações de vizinhos. No total, a Primeira Visitação na Bahia colheu 121 confissões e 212 denunciações.</w:t>
+        <w:t xml:space="preserve">Em junho de 1591, o Visitador Heitor Furtado de Mendonça aportou em Salvador da Bahia, abrindo oficialmente o Tempo de Graça. A Visitação inaugurava um modelo híbrido de controle social: ao mesmo tempo em que ostentava o rigor da justiça hegemônica régio-eclesiástica, baseava-se inteiramente na colaboração comunitária por meio de confissões voluntárias e denunciações de vizinhos. No total, a Primeira Visitação na Bahia colheu 121 confissões e 212 denunciações (VAINFAS, 1997).</w:t>
       </w:r>
     </w:p>
     <w:p>
@@ -595,7 +621,7 @@
         <w:t xml:space="preserve">“Arde-lhe-o-Rabo”</w:t>
       </w:r>
       <w:r>
-        <w:t xml:space="preserve">. Natural de Estremoz e degredada para Pernambuco em virtude de agressão a magistrado e incêndio criminoso, Cajada fixara-se na Bahia por volta de 1578. Denunciada em agosto de 1591 por cinco mulheres sob acusações de feitiçaria diabólica e pacto demoníaco, seu processo (ANTT, Inquisição de Lisboa, proc. 10748) é o que mais se aproxima das categorias demonológicas europeias na Bahia quinhentista. Consta nos autos que ela desenhava o Sinal de Salomão, enterrava botijas na mata, invocava demônios descabelada sob o luar e zombava da autoridade episcopal:</w:t>
+        <w:t xml:space="preserve">. Natural de Estremoz e degredada para Pernambuco em virtude de agressão a magistrado e incêndio criminoso, Cajada fixara-se na Bahia por volta de 1578. Denunciada em agosto de 1591 por acusações de feitiçaria diabólica e pacto demoníaco, seu processo é o que mais se aproxima das categorias demonológicas europeias na Bahia quinhentista (ARAÚJO, 2016). Consta nos autos que ela desenhava o Sinal de Salomão, enterrava botijas na mata, invocava demônios descabelada sob o luar e zombava da autoridade episcopal:</w:t>
       </w:r>
       <w:r>
         <w:t xml:space="preserve"> </w:t>
@@ -820,7 +846,10 @@
         <w:t xml:space="preserve">raça</w:t>
       </w:r>
       <w:r>
-        <w:t xml:space="preserve">.</w:t>
+        <w:t xml:space="preserve"> </w:t>
+      </w:r>
+      <w:r>
+        <w:t xml:space="preserve">(SOUZA, 1986).</w:t>
       </w:r>
     </w:p>
     <w:p>
@@ -874,7 +903,10 @@
         <w:t xml:space="preserve">Malleus Maleficarum</w:t>
       </w:r>
       <w:r>
-        <w:t xml:space="preserve">.</w:t>
+        <w:t xml:space="preserve"> </w:t>
+      </w:r>
+      <w:r>
+        <w:t xml:space="preserve">(SOUZA, 1986).</w:t>
       </w:r>
     </w:p>
     <w:p>
@@ -895,10 +927,7 @@
         <w:t xml:space="preserve">Luzia Pinta</w:t>
       </w:r>
       <w:r>
-        <w:t xml:space="preserve"> </w:t>
-      </w:r>
-      <w:r>
-        <w:t xml:space="preserve">(Inquisição de Lisboa, proc. 252), instruído em 1739 em Sabará (Minas Gerais), ilustra essa mutação. Luzia, mulher preta forra de origem angolana, era procurada na comarca mineira para a realização de calundus, rituais de adivinhação, transe e cura. O Santo Ofício capturou essas práticas interpretando-as como adoração diabólica ativa. O transe ritual do calundu foi traduzido como possessão demoníaca involuntária ou possessão voluntária pactuada. A dança e os tambores foram equiparados às festividades heréticas do sabá europeu.</w:t>
+        <w:t xml:space="preserve">, instruído em 1739 em Sabará (Minas Gerais), ilustra essa mutação. Luzia, mulher preta forra de origem angolana, era procurada na comarca mineira para a realização de calundus, rituais de adivinhação, transe e cura. O Santo Ofício capturou essas práticas interpretando-as como adoração diabólica ativa. O transe ritual do calundu foi traduzido como possessão demoníaca involuntária ou possessão voluntária pactuada. A dança e os tambores foram equiparados às festividades heréticas do sabá europeu.</w:t>
       </w:r>
     </w:p>
     <w:p>
@@ -1043,7 +1072,7 @@
       </w:r>
     </w:p>
     <w:bookmarkEnd w:id="14"/>
-    <w:bookmarkStart w:id="15" w:name="referências"/>
+    <w:bookmarkStart w:id="17" w:name="referências"/>
     <w:p>
       <w:pPr>
         <w:pStyle w:val="Heading2"/>
@@ -1054,11 +1083,7 @@
     </w:p>
     <w:p>
       <w:pPr>
-        <w:pStyle w:val="Compact"/>
-        <w:numPr>
-          <w:ilvl w:val="0"/>
-          <w:numId w:val="1002"/>
-        </w:numPr>
+        <w:pStyle w:val="FirstParagraph"/>
       </w:pPr>
       <w:r>
         <w:t xml:space="preserve">ARAÚJO, Gilmara Cruz de.</w:t>
@@ -1074,16 +1099,12 @@
         <w:t xml:space="preserve">Artes mágicas na Bahia quinhentista</w:t>
       </w:r>
       <w:r>
-        <w:t xml:space="preserve">: o caso de Maria Gonçalves Cajada. Dissertação (Mestrado em História) — Universidade Federal de Sergipe, São Cristóvão, 2016.</w:t>
-      </w:r>
-    </w:p>
-    <w:p>
-      <w:pPr>
-        <w:pStyle w:val="Compact"/>
-        <w:numPr>
-          <w:ilvl w:val="0"/>
-          <w:numId w:val="1002"/>
-        </w:numPr>
+        <w:t xml:space="preserve">: o caso de Maria Gonçalves Cajada. 2016. Dissertação (Mestrado em História) – Universidade Federal de Sergipe, São Cristóvão, 2016.</w:t>
+      </w:r>
+    </w:p>
+    <w:p>
+      <w:pPr>
+        <w:pStyle w:val="BodyText"/>
       </w:pPr>
       <w:r>
         <w:t xml:space="preserve">BROEDEL, Hans Peter.</w:t>
@@ -1104,14 +1125,10 @@
     </w:p>
     <w:p>
       <w:pPr>
-        <w:pStyle w:val="Compact"/>
-        <w:numPr>
-          <w:ilvl w:val="0"/>
-          <w:numId w:val="1002"/>
-        </w:numPr>
-      </w:pPr>
-      <w:r>
-        <w:t xml:space="preserve">INQUISICAO DE LISBOA.</w:t>
+        <w:pStyle w:val="BodyText"/>
+      </w:pPr>
+      <w:r>
+        <w:t xml:space="preserve">PORTUGAL. Arquivo Nacional da Torre do Tombo. Tribunal do Santo Ofício. Inquisição de Lisboa.</w:t>
       </w:r>
       <w:r>
         <w:t xml:space="preserve"> </w:t>
@@ -1124,19 +1141,29 @@
         <w:t xml:space="preserve">Processo de Maria Gonçalves Cajada</w:t>
       </w:r>
       <w:r>
-        <w:t xml:space="preserve">. Processo nº 10748, Tribunal do Santo Ofício, Arquivo Nacional da Torre do Tombo (ANTT), Lisboa. Disponível em: digitarq.arquivos.pt. Acesso em: jun. 2026.</w:t>
-      </w:r>
-    </w:p>
-    <w:p>
-      <w:pPr>
-        <w:pStyle w:val="Compact"/>
-        <w:numPr>
-          <w:ilvl w:val="0"/>
-          <w:numId w:val="1002"/>
-        </w:numPr>
-      </w:pPr>
-      <w:r>
-        <w:t xml:space="preserve">INQUISICAO DE LISBOA.</w:t>
+        <w:t xml:space="preserve">. Lisboa, 1591-1593. Processo n. 10748. Disponível em:</w:t>
+      </w:r>
+      <w:r>
+        <w:t xml:space="preserve"> </w:t>
+      </w:r>
+      <w:hyperlink r:id="rId15">
+        <w:r>
+          <w:rPr>
+            <w:rStyle w:val="Hyperlink"/>
+          </w:rPr>
+          <w:t xml:space="preserve">http://digitarq.arquivos.pt/details?id=4302603</w:t>
+        </w:r>
+      </w:hyperlink>
+      <w:r>
+        <w:t xml:space="preserve">. Acesso em: 30 jun. 2026.</w:t>
+      </w:r>
+    </w:p>
+    <w:p>
+      <w:pPr>
+        <w:pStyle w:val="BodyText"/>
+      </w:pPr>
+      <w:r>
+        <w:t xml:space="preserve">PORTUGAL. Arquivo Nacional da Torre do Tombo. Tribunal do Santo Ofício. Inquisição de Lisboa.</w:t>
       </w:r>
       <w:r>
         <w:t xml:space="preserve"> </w:t>
@@ -1149,16 +1176,26 @@
         <w:t xml:space="preserve">Processo de Luzia Pinta</w:t>
       </w:r>
       <w:r>
-        <w:t xml:space="preserve">. Processo nº 252, Tribunal do Santo Ofício, Arquivo Nacional da Torre do Tombo (ANTT), Lisboa. Disponível em: digitarq.arquivos.pt. Acesso em: jun. 2026.</w:t>
-      </w:r>
-    </w:p>
-    <w:p>
-      <w:pPr>
-        <w:pStyle w:val="Compact"/>
-        <w:numPr>
-          <w:ilvl w:val="0"/>
-          <w:numId w:val="1002"/>
-        </w:numPr>
+        <w:t xml:space="preserve">. Sabará, 1739. Processo n. 252. Disponível em:</w:t>
+      </w:r>
+      <w:r>
+        <w:t xml:space="preserve"> </w:t>
+      </w:r>
+      <w:hyperlink r:id="rId16">
+        <w:r>
+          <w:rPr>
+            <w:rStyle w:val="Hyperlink"/>
+          </w:rPr>
+          <w:t xml:space="preserve">http://digitarq.arquivos.pt/details?id=4302251</w:t>
+        </w:r>
+      </w:hyperlink>
+      <w:r>
+        <w:t xml:space="preserve">. Acesso em: 30 jun. 2026.</w:t>
+      </w:r>
+    </w:p>
+    <w:p>
+      <w:pPr>
+        <w:pStyle w:val="BodyText"/>
       </w:pPr>
       <w:r>
         <w:t xml:space="preserve">SBRICCOLI, Mario. Justiça criminal.</w:t>
@@ -1179,11 +1216,7 @@
     </w:p>
     <w:p>
       <w:pPr>
-        <w:pStyle w:val="Compact"/>
-        <w:numPr>
-          <w:ilvl w:val="0"/>
-          <w:numId w:val="1002"/>
-        </w:numPr>
+        <w:pStyle w:val="BodyText"/>
       </w:pPr>
       <w:r>
         <w:t xml:space="preserve">SOUZA, Laura de Mello e.</w:t>
@@ -1204,11 +1237,7 @@
     </w:p>
     <w:p>
       <w:pPr>
-        <w:pStyle w:val="Compact"/>
-        <w:numPr>
-          <w:ilvl w:val="0"/>
-          <w:numId w:val="1002"/>
-        </w:numPr>
+        <w:pStyle w:val="BodyText"/>
       </w:pPr>
       <w:r>
         <w:t xml:space="preserve">VAINFAS, Ronaldo (org.).</w:t>
@@ -1227,8 +1256,8 @@
         <w:t xml:space="preserve">: Santo Ofício da Inquisição. São Paulo: Companhia das Letras, 1997.</w:t>
       </w:r>
     </w:p>
-    <w:bookmarkEnd w:id="15"/>
-    <w:bookmarkEnd w:id="16"/>
+    <w:bookmarkEnd w:id="17"/>
+    <w:bookmarkEnd w:id="18"/>
     <w:sectPr>
       <w:footnotePr>
         <w:numRestart w:val="eachSect"/>
@@ -1422,109 +1451,6 @@
       <w:pPr>
         <w:ind w:left="6480" w:hanging="360"/>
       </w:pPr>
-    </w:lvl>
-  </w:abstractNum>
-  <w:abstractNum w:abstractNumId="991">
-    <w:nsid w:val="0000A991"/>
-    <w:multiLevelType w:val="multilevel"/>
-    <w:lvl w:ilvl="0">
-      <w:numFmt w:val="bullet"/>
-      <w:lvlText w:val=""/>
-      <w:lvlJc w:val="left"/>
-      <w:pPr>
-        <w:ind w:left="720" w:hanging="360"/>
-      </w:pPr>
-      <w:rPr>
-        <w:rFonts w:ascii="Symbol" w:hAnsi="Symbol" w:cs="Symbol" w:hint="default"/>
-      </w:rPr>
-    </w:lvl>
-    <w:lvl w:ilvl="1">
-      <w:numFmt w:val="bullet"/>
-      <w:lvlText w:val="o"/>
-      <w:lvlJc w:val="left"/>
-      <w:pPr>
-        <w:ind w:left="1440" w:hanging="360"/>
-      </w:pPr>
-      <w:rPr>
-        <w:rFonts w:ascii="Courier New" w:hAnsi="Courier New" w:cs="Courier New" w:hint="default"/>
-      </w:rPr>
-    </w:lvl>
-    <w:lvl w:ilvl="2">
-      <w:numFmt w:val="bullet"/>
-      <w:lvlText w:val=""/>
-      <w:lvlJc w:val="left"/>
-      <w:pPr>
-        <w:ind w:left="2160" w:hanging="360"/>
-      </w:pPr>
-      <w:rPr>
-        <w:rFonts w:ascii="Wingdings" w:hAnsi="Wingdings" w:cs="Wingdings" w:hint="default"/>
-      </w:rPr>
-    </w:lvl>
-    <w:lvl w:ilvl="3">
-      <w:numFmt w:val="bullet"/>
-      <w:lvlText w:val=""/>
-      <w:lvlJc w:val="left"/>
-      <w:pPr>
-        <w:ind w:left="2880" w:hanging="360"/>
-      </w:pPr>
-      <w:rPr>
-        <w:rFonts w:ascii="Symbol" w:hAnsi="Symbol" w:cs="Symbol" w:hint="default"/>
-      </w:rPr>
-    </w:lvl>
-    <w:lvl w:ilvl="4">
-      <w:numFmt w:val="bullet"/>
-      <w:lvlText w:val="o"/>
-      <w:lvlJc w:val="left"/>
-      <w:pPr>
-        <w:ind w:left="3600" w:hanging="360"/>
-      </w:pPr>
-      <w:rPr>
-        <w:rFonts w:ascii="Courier New" w:hAnsi="Courier New" w:cs="Courier New" w:hint="default"/>
-      </w:rPr>
-    </w:lvl>
-    <w:lvl w:ilvl="5">
-      <w:numFmt w:val="bullet"/>
-      <w:lvlText w:val=""/>
-      <w:lvlJc w:val="left"/>
-      <w:pPr>
-        <w:ind w:left="4320" w:hanging="360"/>
-      </w:pPr>
-      <w:rPr>
-        <w:rFonts w:ascii="Wingdings" w:hAnsi="Wingdings" w:cs="Wingdings" w:hint="default"/>
-      </w:rPr>
-    </w:lvl>
-    <w:lvl w:ilvl="6">
-      <w:numFmt w:val="bullet"/>
-      <w:lvlText w:val=""/>
-      <w:lvlJc w:val="left"/>
-      <w:pPr>
-        <w:ind w:left="5040" w:hanging="360"/>
-      </w:pPr>
-      <w:rPr>
-        <w:rFonts w:ascii="Symbol" w:hAnsi="Symbol" w:cs="Symbol" w:hint="default"/>
-      </w:rPr>
-    </w:lvl>
-    <w:lvl w:ilvl="7">
-      <w:numFmt w:val="bullet"/>
-      <w:lvlText w:val="o"/>
-      <w:lvlJc w:val="left"/>
-      <w:pPr>
-        <w:ind w:left="5760" w:hanging="360"/>
-      </w:pPr>
-      <w:rPr>
-        <w:rFonts w:ascii="Courier New" w:hAnsi="Courier New" w:cs="Courier New" w:hint="default"/>
-      </w:rPr>
-    </w:lvl>
-    <w:lvl w:ilvl="8">
-      <w:numFmt w:val="bullet"/>
-      <w:lvlText w:val=""/>
-      <w:lvlJc w:val="left"/>
-      <w:pPr>
-        <w:ind w:left="6480" w:hanging="360"/>
-      </w:pPr>
-      <w:rPr>
-        <w:rFonts w:ascii="Wingdings" w:hAnsi="Wingdings" w:cs="Wingdings" w:hint="default"/>
-      </w:rPr>
     </w:lvl>
   </w:abstractNum>
   <w:num w:numId="1000">
@@ -1559,9 +1485,6 @@
     <w:lvlOverride w:ilvl="8">
       <w:startOverride w:val="1"/>
     </w:lvlOverride>
-  </w:num>
-  <w:num w:numId="1002">
-    <w:abstractNumId w:val="991"/>
   </w:num>
 </w:numbering>
 </file>

</xml_diff>